<commit_message>
feat: Add About overlay and update documentation
- Introduced a read-only About overlay accessible from the Settings card and sidebar.
- Updated the application version to 1.0.0 and added license information.
- Enhanced documentation to include details about the application, its features, and contributors.
- Implemented new components for the About dialog and integrated it with the existing UI.
- Updated testing suite to cover new About overlay functionality and ensure proper behavior.
- Added MIT License file to the project.
</commit_message>
<xml_diff>
--- a/doc/00-index.docx
+++ b/doc/00-index.docx
@@ -628,7 +628,7 @@
       </w:r>
     </w:p>
     <w:bookmarkEnd w:id="19"/>
-    <w:bookmarkStart w:id="20" w:name="the-app-in-eight-lines"/>
+    <w:bookmarkStart w:id="20" w:name="the-app-in-nine-lines"/>
     <w:p>
       <w:pPr>
         <w:pStyle w:val="Heading1"/>
@@ -643,7 +643,7 @@
         <w:tab/>
       </w:r>
       <w:r>
-        <w:t xml:space="preserve">The app in eight lines</w:t>
+        <w:t xml:space="preserve">The app in nine lines</w:t>
       </w:r>
     </w:p>
     <w:p>
@@ -877,6 +877,24 @@
       </w:r>
       <w:r>
         <w:t xml:space="preserve">holds every byte of state.</w:t>
+      </w:r>
+    </w:p>
+    <w:p>
+      <w:pPr>
+        <w:pStyle w:val="Compact"/>
+        <w:numPr>
+          <w:ilvl w:val="0"/>
+          <w:numId w:val="1001"/>
+        </w:numPr>
+      </w:pPr>
+      <w:r>
+        <w:t xml:space="preserve">It is free and open source under the MIT License (version 1.0.0); the in-app</w:t>
+      </w:r>
+      <w:r>
+        <w:t xml:space="preserve"> </w:t>
+      </w:r>
+      <w:r>
+        <w:t xml:space="preserve">About panel repeats the license, author and contributor details.</w:t>
       </w:r>
     </w:p>
     <w:bookmarkEnd w:id="20"/>

</xml_diff>